<commit_message>
Exercice tri à bulle
</commit_message>
<xml_diff>
--- a/Exercie tri.docx
+++ b/Exercie tri.docx
@@ -114,15 +114,15 @@
     </w:p>
     <w:p>
       <w:r>
-        <w:t xml:space="preserve">Il </w:t>
-      </w:r>
-      <w:proofErr w:type="spellStart"/>
-      <w:r>
-        <w:t>ya</w:t>
-      </w:r>
-      <w:proofErr w:type="spellEnd"/>
-      <w:r>
-        <w:t xml:space="preserve"> 5 index donc au premier tour le dernier j sera sur l'index 5-2=3 </w:t>
+        <w:t>Il y</w:t>
+      </w:r>
+      <w:r>
+        <w:t xml:space="preserve"> </w:t>
+      </w:r>
+      <w:bookmarkStart w:id="0" w:name="_GoBack"/>
+      <w:bookmarkEnd w:id="0"/>
+      <w:r>
+        <w:t xml:space="preserve">a 5 index donc au premier tour le dernier j sera sur l'index 5-2=3 </w:t>
       </w:r>
     </w:p>
     <w:p>
@@ -163,12 +163,7 @@
         <w:t>5, 1</w:t>
       </w:r>
       <w:r>
-        <w:t>, 4, 2, 8] i=0 et j=</w:t>
-      </w:r>
-      <w:bookmarkStart w:id="0" w:name="_GoBack"/>
-      <w:bookmarkEnd w:id="0"/>
-      <w:r>
-        <w:t>0 &lt;- compare 5 et 1 donc échange</w:t>
+        <w:t>, 4, 2, 8] i=0 et j=0 &lt;- compare 5 et 1 donc échange</w:t>
       </w:r>
     </w:p>
     <w:p>
@@ -214,11 +209,9 @@
       </w:r>
     </w:p>
     <w:p>
-      <w:proofErr w:type="spellStart"/>
-      <w:r>
-        <w:t>Deuxièpe</w:t>
-      </w:r>
-      <w:proofErr w:type="spellEnd"/>
+      <w:r>
+        <w:t>Deuxième</w:t>
+      </w:r>
       <w:r>
         <w:t xml:space="preserve"> tour</w:t>
       </w:r>

</xml_diff>

<commit_message>
Exercice tri par selection
</commit_message>
<xml_diff>
--- a/Exercie tri.docx
+++ b/Exercie tri.docx
@@ -119,197 +119,845 @@
       <w:r>
         <w:t xml:space="preserve"> </w:t>
       </w:r>
+      <w:r>
+        <w:t xml:space="preserve">a 5 index donc au premier tour le dernier j sera sur l'index 5-2=3 </w:t>
+      </w:r>
+    </w:p>
+    <w:p>
+      <w:proofErr w:type="gramStart"/>
+      <w:r>
+        <w:t>n</w:t>
+      </w:r>
+      <w:proofErr w:type="gramEnd"/>
+      <w:r>
+        <w:t xml:space="preserve"> &lt;- longueur tableau</w:t>
+      </w:r>
+    </w:p>
+    <w:p>
+      <w:r>
+        <w:t>POUR i de 0 à taille de n - 2</w:t>
+      </w:r>
+    </w:p>
+    <w:p>
+      <w:r>
+        <w:tab/>
+        <w:t>POUR j de 0 à taille de n -2 -i</w:t>
+      </w:r>
+    </w:p>
+    <w:p/>
+    <w:p>
+      <w:r>
+        <w:t>Premier tour</w:t>
+      </w:r>
+    </w:p>
+    <w:p>
+      <w:r>
+        <w:t>[</w:t>
+      </w:r>
+      <w:r>
+        <w:rPr>
+          <w:u w:val="single"/>
+        </w:rPr>
+        <w:t>5, 1</w:t>
+      </w:r>
+      <w:r>
+        <w:t>, 4, 2, 8] i=0 et j=0 &lt;- compare 5 et 1 donc échange</w:t>
+      </w:r>
+    </w:p>
+    <w:p>
+      <w:r>
+        <w:t xml:space="preserve">[1, </w:t>
+      </w:r>
+      <w:r>
+        <w:rPr>
+          <w:u w:val="single"/>
+        </w:rPr>
+        <w:t>5, 4</w:t>
+      </w:r>
+      <w:r>
+        <w:t>, 2, 8] i=0 et j=1 &lt;- compare 5 et 4 donc échange</w:t>
+      </w:r>
+    </w:p>
+    <w:p>
+      <w:r>
+        <w:t xml:space="preserve">[1, 4, </w:t>
+      </w:r>
+      <w:r>
+        <w:rPr>
+          <w:u w:val="single"/>
+        </w:rPr>
+        <w:t>5, 2</w:t>
+      </w:r>
+      <w:r>
+        <w:t>, 8] i=0 et j=2 &lt;- compare 5 et 2 donc échange</w:t>
+      </w:r>
+    </w:p>
+    <w:p>
+      <w:r>
+        <w:t xml:space="preserve">[1, 4, 2, </w:t>
+      </w:r>
+      <w:r>
+        <w:rPr>
+          <w:u w:val="single"/>
+        </w:rPr>
+        <w:t>5, 8</w:t>
+      </w:r>
+      <w:r>
+        <w:t>] i=0 et j=3 &lt;- compare 5 et 8 donc pas d'échange</w:t>
+      </w:r>
+    </w:p>
+    <w:p>
+      <w:r>
+        <w:t>Deuxième</w:t>
+      </w:r>
+      <w:r>
+        <w:t xml:space="preserve"> tour</w:t>
+      </w:r>
+    </w:p>
+    <w:p>
+      <w:r>
+        <w:t>[</w:t>
+      </w:r>
+      <w:r>
+        <w:rPr>
+          <w:u w:val="single"/>
+        </w:rPr>
+        <w:t>1, 4</w:t>
+      </w:r>
+      <w:r>
+        <w:t>, 2, 5, 8] i=1 et j=0 &lt;- compare 1 et 4 donc pas d'échange</w:t>
+      </w:r>
+    </w:p>
+    <w:p>
+      <w:r>
+        <w:t xml:space="preserve">[1, </w:t>
+      </w:r>
+      <w:r>
+        <w:rPr>
+          <w:u w:val="single"/>
+        </w:rPr>
+        <w:t>4, 2</w:t>
+      </w:r>
+      <w:r>
+        <w:t>, 5, 8] i=1 et j=1 &lt;- compare 4 et 2 donc échange</w:t>
+      </w:r>
+    </w:p>
+    <w:p>
+      <w:r>
+        <w:t xml:space="preserve">[1, 2, </w:t>
+      </w:r>
+      <w:r>
+        <w:rPr>
+          <w:u w:val="single"/>
+        </w:rPr>
+        <w:t>4, 5</w:t>
+      </w:r>
+      <w:r>
+        <w:t>, 8] i=1 et j=2 &lt;- compare 4 et 5 donc pas d'échange</w:t>
+      </w:r>
+    </w:p>
+    <w:p>
+      <w:r>
+        <w:t>Troisième tour</w:t>
+      </w:r>
+    </w:p>
+    <w:p>
+      <w:r>
+        <w:t>[</w:t>
+      </w:r>
+      <w:r>
+        <w:rPr>
+          <w:u w:val="single"/>
+        </w:rPr>
+        <w:t>1, 2,</w:t>
+      </w:r>
+      <w:r>
+        <w:t xml:space="preserve"> 4, 5, 8] i=2 et j=0 &lt;- compare 1 et 2 donc pas d'échange</w:t>
+      </w:r>
+    </w:p>
+    <w:p>
+      <w:r>
+        <w:t xml:space="preserve">[1, </w:t>
+      </w:r>
+      <w:r>
+        <w:rPr>
+          <w:u w:val="single"/>
+        </w:rPr>
+        <w:t>2, 4</w:t>
+      </w:r>
+      <w:r>
+        <w:t>, 5, 8] i=2 et j=1 &lt;- compare 2 et 4 donc pas d'échange</w:t>
+      </w:r>
+    </w:p>
+    <w:p>
+      <w:r>
+        <w:t>Quatrième tour</w:t>
+      </w:r>
+    </w:p>
+    <w:p>
+      <w:r>
+        <w:t>[</w:t>
+      </w:r>
+      <w:r>
+        <w:rPr>
+          <w:u w:val="single"/>
+        </w:rPr>
+        <w:t>1, 2</w:t>
+      </w:r>
+      <w:r>
+        <w:t>, 4, 5, 8] i=3 et j=0 &lt;- compare 1 et 2 donc pas d'échange</w:t>
+      </w:r>
+    </w:p>
+    <w:p>
+      <w:r>
+        <w:br w:type="page"/>
+      </w:r>
+    </w:p>
+    <w:p>
+      <w:pPr>
+        <w:spacing w:after="0" w:line="330" w:lineRule="atLeast"/>
+        <w:textAlignment w:val="baseline"/>
+        <w:outlineLvl w:val="0"/>
+        <w:rPr>
+          <w:rFonts w:eastAsia="Times New Roman" w:cstheme="minorHAnsi"/>
+          <w:b/>
+          <w:bCs/>
+          <w:kern w:val="36"/>
+          <w:sz w:val="48"/>
+          <w:szCs w:val="48"/>
+          <w:lang w:eastAsia="fr-FR"/>
+        </w:rPr>
+      </w:pPr>
+      <w:r>
+        <w:rPr>
+          <w:rFonts w:eastAsia="Times New Roman" w:cstheme="minorHAnsi"/>
+          <w:b/>
+          <w:bCs/>
+          <w:kern w:val="36"/>
+          <w:sz w:val="36"/>
+          <w:szCs w:val="36"/>
+          <w:bdr w:val="none" w:sz="0" w:space="0" w:color="auto" w:frame="1"/>
+          <w:lang w:eastAsia="fr-FR"/>
+        </w:rPr>
+        <w:lastRenderedPageBreak/>
+        <w:t>Exercice 2 : Tri par sélection guidé</w:t>
+      </w:r>
+    </w:p>
+    <w:p>
+      <w:pPr>
+        <w:spacing w:after="0" w:line="240" w:lineRule="auto"/>
+        <w:rPr>
+          <w:rFonts w:eastAsia="Times New Roman" w:cstheme="minorHAnsi"/>
+          <w:sz w:val="24"/>
+          <w:szCs w:val="24"/>
+          <w:lang w:eastAsia="fr-FR"/>
+        </w:rPr>
+      </w:pPr>
+      <w:r>
+        <w:rPr>
+          <w:rFonts w:eastAsia="Times New Roman" w:cstheme="minorHAnsi"/>
+          <w:sz w:val="24"/>
+          <w:szCs w:val="24"/>
+          <w:bdr w:val="none" w:sz="0" w:space="0" w:color="auto" w:frame="1"/>
+          <w:lang w:eastAsia="fr-FR"/>
+        </w:rPr>
+        <w:t xml:space="preserve">Soit le tableau : </w:t>
+      </w:r>
+      <w:r>
+        <w:rPr>
+          <w:rFonts w:eastAsia="Times New Roman" w:cstheme="minorHAnsi"/>
+          <w:sz w:val="20"/>
+          <w:szCs w:val="20"/>
+          <w:bdr w:val="single" w:sz="6" w:space="0" w:color="auto" w:frame="1"/>
+          <w:lang w:eastAsia="fr-FR"/>
+        </w:rPr>
+        <w:t>[29, 10, 14, 37, 13, 25]</w:t>
+      </w:r>
+      <w:r>
+        <w:rPr>
+          <w:rFonts w:eastAsia="Times New Roman" w:cstheme="minorHAnsi"/>
+          <w:sz w:val="24"/>
+          <w:szCs w:val="24"/>
+          <w:bdr w:val="none" w:sz="0" w:space="0" w:color="auto" w:frame="1"/>
+          <w:lang w:eastAsia="fr-FR"/>
+        </w:rPr>
+        <w:t xml:space="preserve"> </w:t>
+      </w:r>
+    </w:p>
+    <w:p>
+      <w:pPr>
+        <w:spacing w:after="0" w:line="240" w:lineRule="auto"/>
+        <w:textAlignment w:val="baseline"/>
+        <w:rPr>
+          <w:rFonts w:eastAsia="Times New Roman" w:cstheme="minorHAnsi"/>
+          <w:sz w:val="24"/>
+          <w:szCs w:val="24"/>
+          <w:lang w:eastAsia="fr-FR"/>
+        </w:rPr>
+      </w:pPr>
+      <w:r>
+        <w:rPr>
+          <w:rFonts w:eastAsia="Times New Roman" w:cstheme="minorHAnsi"/>
+          <w:sz w:val="24"/>
+          <w:szCs w:val="24"/>
+          <w:bdr w:val="none" w:sz="0" w:space="0" w:color="auto" w:frame="1"/>
+          <w:lang w:eastAsia="fr-FR"/>
+        </w:rPr>
+        <w:t>Appliquer l'algorithme du tri par sélection</w:t>
+      </w:r>
+    </w:p>
+    <w:p>
+      <w:pPr>
+        <w:spacing w:after="0" w:line="240" w:lineRule="auto"/>
+        <w:textAlignment w:val="baseline"/>
+        <w:rPr>
+          <w:rFonts w:eastAsia="Times New Roman" w:cstheme="minorHAnsi"/>
+          <w:sz w:val="24"/>
+          <w:szCs w:val="24"/>
+          <w:lang w:eastAsia="fr-FR"/>
+        </w:rPr>
+      </w:pPr>
+      <w:r>
+        <w:rPr>
+          <w:rFonts w:eastAsia="Times New Roman" w:cstheme="minorHAnsi"/>
+          <w:sz w:val="24"/>
+          <w:szCs w:val="24"/>
+          <w:bdr w:val="none" w:sz="0" w:space="0" w:color="auto" w:frame="1"/>
+          <w:lang w:eastAsia="fr-FR"/>
+        </w:rPr>
+        <w:t>À chaque passage, identifier le minimum trouvé</w:t>
+      </w:r>
+    </w:p>
+    <w:p>
+      <w:pPr>
+        <w:spacing w:after="0" w:line="240" w:lineRule="auto"/>
+        <w:textAlignment w:val="baseline"/>
+        <w:rPr>
+          <w:rFonts w:eastAsia="Times New Roman" w:cstheme="minorHAnsi"/>
+          <w:sz w:val="24"/>
+          <w:szCs w:val="24"/>
+          <w:lang w:eastAsia="fr-FR"/>
+        </w:rPr>
+      </w:pPr>
+      <w:r>
+        <w:rPr>
+          <w:rFonts w:eastAsia="Times New Roman" w:cstheme="minorHAnsi"/>
+          <w:sz w:val="24"/>
+          <w:szCs w:val="24"/>
+          <w:bdr w:val="none" w:sz="0" w:space="0" w:color="auto" w:frame="1"/>
+          <w:lang w:eastAsia="fr-FR"/>
+        </w:rPr>
+        <w:t>Indiquer l'échange effectué</w:t>
+      </w:r>
+    </w:p>
+    <w:p>
+      <w:pPr>
+        <w:spacing w:after="0" w:line="240" w:lineRule="auto"/>
+        <w:textAlignment w:val="baseline"/>
+        <w:rPr>
+          <w:rFonts w:eastAsia="Times New Roman" w:cstheme="minorHAnsi"/>
+          <w:sz w:val="24"/>
+          <w:szCs w:val="24"/>
+          <w:lang w:eastAsia="fr-FR"/>
+        </w:rPr>
+      </w:pPr>
+      <w:r>
+        <w:rPr>
+          <w:rFonts w:eastAsia="Times New Roman" w:cstheme="minorHAnsi"/>
+          <w:sz w:val="24"/>
+          <w:szCs w:val="24"/>
+          <w:bdr w:val="none" w:sz="0" w:space="0" w:color="auto" w:frame="1"/>
+          <w:lang w:eastAsia="fr-FR"/>
+        </w:rPr>
+        <w:t>Tracer l'état du tableau après chaque passage</w:t>
+      </w:r>
+    </w:p>
+    <w:p/>
+    <w:p>
+      <w:r>
+        <w:t>//Il y a 5 index, alors le i max sera 5-2=3 plus ajouter le tour 0 donc 4 tour en tout</w:t>
+      </w:r>
+    </w:p>
+    <w:p>
+      <w:r>
+        <w:t xml:space="preserve">Il y a 5 index donc au premier tour le dernier j sera sur l'index 5-2=3 </w:t>
+      </w:r>
+    </w:p>
+    <w:p>
+      <w:proofErr w:type="gramStart"/>
+      <w:r>
+        <w:t>n</w:t>
+      </w:r>
+      <w:proofErr w:type="gramEnd"/>
+      <w:r>
+        <w:t xml:space="preserve"> &lt;- longueur </w:t>
+      </w:r>
+      <w:r>
+        <w:t>(</w:t>
+      </w:r>
+      <w:r>
+        <w:t>tableau</w:t>
+      </w:r>
+      <w:r>
+        <w:t>)</w:t>
+      </w:r>
+    </w:p>
+    <w:p>
+      <w:r>
+        <w:t>POUR i de 0 à n -2</w:t>
+      </w:r>
+    </w:p>
+    <w:p>
+      <w:proofErr w:type="spellStart"/>
+      <w:proofErr w:type="gramStart"/>
+      <w:r>
+        <w:t>indexmin</w:t>
+      </w:r>
+      <w:proofErr w:type="spellEnd"/>
+      <w:proofErr w:type="gramEnd"/>
+      <w:r>
+        <w:t xml:space="preserve"> &lt;- i</w:t>
+      </w:r>
+    </w:p>
+    <w:p>
+      <w:r>
+        <w:tab/>
+        <w:t>POUR j de i+1 à n-1</w:t>
+      </w:r>
+    </w:p>
+    <w:p>
+      <w:r>
+        <w:tab/>
+      </w:r>
+      <w:r>
+        <w:tab/>
+        <w:t>SI tab[j] &lt; tab [</w:t>
+      </w:r>
+      <w:proofErr w:type="spellStart"/>
+      <w:r>
+        <w:t>indexmin</w:t>
+      </w:r>
+      <w:proofErr w:type="spellEnd"/>
+      <w:r>
+        <w:t>]</w:t>
+      </w:r>
+    </w:p>
+    <w:p>
+      <w:r>
+        <w:tab/>
+      </w:r>
+      <w:r>
+        <w:tab/>
+      </w:r>
+      <w:r>
+        <w:tab/>
+      </w:r>
+      <w:proofErr w:type="spellStart"/>
+      <w:proofErr w:type="gramStart"/>
+      <w:r>
+        <w:t>indexmin</w:t>
+      </w:r>
+      <w:proofErr w:type="spellEnd"/>
+      <w:proofErr w:type="gramEnd"/>
+      <w:r>
+        <w:t xml:space="preserve"> &lt;- j</w:t>
+      </w:r>
+    </w:p>
+    <w:p>
+      <w:r>
+        <w:tab/>
+      </w:r>
+      <w:r>
+        <w:tab/>
+        <w:t>FIN SI</w:t>
+      </w:r>
+    </w:p>
+    <w:p>
+      <w:r>
+        <w:tab/>
+        <w:t>FIN POUR</w:t>
+      </w:r>
+    </w:p>
+    <w:p>
+      <w:r>
+        <w:tab/>
+        <w:t xml:space="preserve">SI </w:t>
+      </w:r>
+      <w:proofErr w:type="spellStart"/>
+      <w:r>
+        <w:t>indexmin</w:t>
+      </w:r>
+      <w:proofErr w:type="spellEnd"/>
+      <w:proofErr w:type="gramStart"/>
+      <w:r>
+        <w:t> !=</w:t>
+      </w:r>
+      <w:proofErr w:type="gramEnd"/>
+      <w:r>
+        <w:t xml:space="preserve"> i</w:t>
+      </w:r>
+    </w:p>
+    <w:p>
+      <w:r>
+        <w:tab/>
+      </w:r>
+      <w:r>
+        <w:tab/>
+      </w:r>
+      <w:proofErr w:type="spellStart"/>
+      <w:proofErr w:type="gramStart"/>
+      <w:r>
+        <w:t>temp</w:t>
+      </w:r>
+      <w:proofErr w:type="spellEnd"/>
+      <w:proofErr w:type="gramEnd"/>
+      <w:r>
+        <w:t xml:space="preserve"> &lt;- tab[i]</w:t>
+      </w:r>
+    </w:p>
+    <w:p>
+      <w:r>
+        <w:tab/>
+      </w:r>
+      <w:r>
+        <w:tab/>
+      </w:r>
+      <w:proofErr w:type="gramStart"/>
+      <w:r>
+        <w:t>tab</w:t>
+      </w:r>
+      <w:proofErr w:type="gramEnd"/>
+      <w:r>
+        <w:t>[i] &lt;- tab[</w:t>
+      </w:r>
+      <w:proofErr w:type="spellStart"/>
+      <w:r>
+        <w:t>indexmin</w:t>
+      </w:r>
+      <w:proofErr w:type="spellEnd"/>
+      <w:r>
+        <w:t>]</w:t>
+      </w:r>
+    </w:p>
+    <w:p>
+      <w:r>
+        <w:tab/>
+      </w:r>
+      <w:r>
+        <w:tab/>
+      </w:r>
+      <w:proofErr w:type="gramStart"/>
+      <w:r>
+        <w:t>tab</w:t>
+      </w:r>
+      <w:proofErr w:type="gramEnd"/>
+      <w:r>
+        <w:t>[</w:t>
+      </w:r>
+      <w:proofErr w:type="spellStart"/>
+      <w:r>
+        <w:t>indexmin</w:t>
+      </w:r>
+      <w:proofErr w:type="spellEnd"/>
+      <w:r>
+        <w:t xml:space="preserve">] &lt;- </w:t>
+      </w:r>
+      <w:proofErr w:type="spellStart"/>
+      <w:r>
+        <w:t>temp</w:t>
+      </w:r>
+      <w:proofErr w:type="spellEnd"/>
+    </w:p>
+    <w:p>
+      <w:r>
+        <w:tab/>
+        <w:t>FIN SI</w:t>
+      </w:r>
+    </w:p>
+    <w:p>
+      <w:r>
+        <w:t>FIN POUR</w:t>
+      </w:r>
+    </w:p>
+    <w:p>
+      <w:r>
+        <w:t>FIN</w:t>
+      </w:r>
+    </w:p>
+    <w:p/>
+    <w:p>
+      <w:r>
+        <w:t>[29, 10, 14, 37, 13, 25]</w:t>
+      </w:r>
+    </w:p>
+    <w:p>
+      <w:r>
+        <w:t>//Il y aura 6-2=4 plus le premier passage donc 5 passage</w:t>
+      </w:r>
+    </w:p>
+    <w:p>
       <w:bookmarkStart w:id="0" w:name="_GoBack"/>
       <w:bookmarkEnd w:id="0"/>
-      <w:r>
-        <w:t xml:space="preserve">a 5 index donc au premier tour le dernier j sera sur l'index 5-2=3 </w:t>
-      </w:r>
-    </w:p>
-    <w:p>
+    </w:p>
+    <w:p>
+      <w:r>
+        <w:t>Premier passage i=0</w:t>
+      </w:r>
+    </w:p>
+    <w:p>
+      <w:r>
+        <w:t>[29, 10, 14, 37, 13, 25]</w:t>
+      </w:r>
+      <w:r>
+        <w:t xml:space="preserve"> valeur de référence au début : </w:t>
+      </w:r>
       <w:proofErr w:type="gramStart"/>
       <w:r>
-        <w:t>n</w:t>
+        <w:t>tab[</w:t>
       </w:r>
       <w:proofErr w:type="gramEnd"/>
       <w:r>
-        <w:t xml:space="preserve"> &lt;- longueur tableau</w:t>
-      </w:r>
-    </w:p>
-    <w:p>
-      <w:r>
-        <w:t>POUR i de 0 à taille de n - 2</w:t>
-      </w:r>
-    </w:p>
-    <w:p>
-      <w:r>
-        <w:tab/>
-        <w:t>POUR j de 0 à taille de n -2 -i</w:t>
+        <w:t xml:space="preserve">0]=29  </w:t>
+      </w:r>
+      <w:proofErr w:type="spellStart"/>
+      <w:r>
+        <w:t>indexmin</w:t>
+      </w:r>
+      <w:proofErr w:type="spellEnd"/>
+      <w:r>
+        <w:t>=tab[1] &lt;- 10</w:t>
+      </w:r>
+    </w:p>
+    <w:p>
+      <w:r>
+        <w:tab/>
+        <w:t>Résultat [10, 29, 14, 37, 13, 25]</w:t>
+      </w:r>
+    </w:p>
+    <w:p>
+      <w:r>
+        <w:t>Deuxième passage i=1</w:t>
+      </w:r>
+    </w:p>
+    <w:p>
+      <w:r>
+        <w:t>[</w:t>
+      </w:r>
+      <w:r>
+        <w:t>10</w:t>
+      </w:r>
+      <w:r>
+        <w:t xml:space="preserve">, </w:t>
+      </w:r>
+      <w:r>
+        <w:t>29</w:t>
+      </w:r>
+      <w:r>
+        <w:t xml:space="preserve">, 14, 37, 13, 25] valeur de référence au début : </w:t>
+      </w:r>
+      <w:proofErr w:type="gramStart"/>
+      <w:r>
+        <w:t>tab[</w:t>
+      </w:r>
+      <w:proofErr w:type="gramEnd"/>
+      <w:r>
+        <w:t>1</w:t>
+      </w:r>
+      <w:r>
+        <w:t xml:space="preserve">]=29, </w:t>
+      </w:r>
+      <w:proofErr w:type="spellStart"/>
+      <w:r>
+        <w:t>indexmin</w:t>
+      </w:r>
+      <w:proofErr w:type="spellEnd"/>
+      <w:r>
+        <w:t>=tab[4] &lt;- 13</w:t>
+      </w:r>
+    </w:p>
+    <w:p>
+      <w:r>
+        <w:lastRenderedPageBreak/>
+        <w:tab/>
+        <w:t>Résultat [10, 13, 14, 37, 29</w:t>
+      </w:r>
+      <w:r>
+        <w:t>, 25]</w:t>
+      </w:r>
+    </w:p>
+    <w:p>
+      <w:r>
+        <w:t>Troisième passage i=2</w:t>
+      </w:r>
+    </w:p>
+    <w:p>
+      <w:r>
+        <w:t>[10, 13, 14, 37, 29, 25]</w:t>
+      </w:r>
+      <w:r>
+        <w:t xml:space="preserve"> </w:t>
+      </w:r>
+      <w:r>
+        <w:t xml:space="preserve">valeur de référence au début : </w:t>
+      </w:r>
+      <w:proofErr w:type="gramStart"/>
+      <w:r>
+        <w:t>tab[</w:t>
+      </w:r>
+      <w:proofErr w:type="gramEnd"/>
+      <w:r>
+        <w:t>2</w:t>
+      </w:r>
+      <w:r>
+        <w:t>]</w:t>
+      </w:r>
+      <w:r>
+        <w:t>=14</w:t>
+      </w:r>
+      <w:r>
+        <w:t xml:space="preserve">, </w:t>
+      </w:r>
+      <w:proofErr w:type="spellStart"/>
+      <w:r>
+        <w:t>indexmin</w:t>
+      </w:r>
+      <w:proofErr w:type="spellEnd"/>
+      <w:r>
+        <w:t>=tab[2</w:t>
+      </w:r>
+      <w:r>
+        <w:t>]</w:t>
+      </w:r>
+      <w:r>
+        <w:t xml:space="preserve"> &lt;- 14</w:t>
+      </w:r>
+    </w:p>
+    <w:p>
+      <w:r>
+        <w:tab/>
+        <w:t>Résultat [10, 13, 14, 37, 29, 25]</w:t>
+      </w:r>
+    </w:p>
+    <w:p>
+      <w:r>
+        <w:t>Quatrième passage i=3</w:t>
+      </w:r>
+    </w:p>
+    <w:p>
+      <w:r>
+        <w:t xml:space="preserve">[10, 13, 14, 37, 29, 25] valeur de référence au début : </w:t>
+      </w:r>
+      <w:proofErr w:type="gramStart"/>
+      <w:r>
+        <w:t>tab[</w:t>
+      </w:r>
+      <w:proofErr w:type="gramEnd"/>
+      <w:r>
+        <w:t>3</w:t>
+      </w:r>
+      <w:r>
+        <w:t>]</w:t>
+      </w:r>
+      <w:r>
+        <w:t>=37</w:t>
+      </w:r>
+      <w:r>
+        <w:t xml:space="preserve">, </w:t>
+      </w:r>
+      <w:proofErr w:type="spellStart"/>
+      <w:r>
+        <w:t>indexmin</w:t>
+      </w:r>
+      <w:proofErr w:type="spellEnd"/>
+      <w:r>
+        <w:t>=tab[5</w:t>
+      </w:r>
+      <w:r>
+        <w:t>] &lt;-</w:t>
+      </w:r>
+      <w:r>
+        <w:t xml:space="preserve"> 25</w:t>
+      </w:r>
+    </w:p>
+    <w:p>
+      <w:r>
+        <w:tab/>
+        <w:t>Résultat [10, 13, 14, 25</w:t>
+      </w:r>
+      <w:r>
+        <w:t>, 29</w:t>
+      </w:r>
+      <w:r>
+        <w:t>, 37</w:t>
+      </w:r>
+      <w:r>
+        <w:t>]</w:t>
+      </w:r>
+    </w:p>
+    <w:p>
+      <w:r>
+        <w:t>Cinquième passage i=4</w:t>
+      </w:r>
+    </w:p>
+    <w:p>
+      <w:r>
+        <w:t>[</w:t>
+      </w:r>
+      <w:r>
+        <w:t>10, 13, 14, 25, 29, 37]</w:t>
+      </w:r>
+      <w:r>
+        <w:t xml:space="preserve"> </w:t>
+      </w:r>
+      <w:r>
+        <w:t xml:space="preserve">valeur de référence au début : </w:t>
+      </w:r>
+      <w:proofErr w:type="gramStart"/>
+      <w:r>
+        <w:t>tab[</w:t>
+      </w:r>
+      <w:proofErr w:type="gramEnd"/>
+      <w:r>
+        <w:t>4</w:t>
+      </w:r>
+      <w:r>
+        <w:t>]</w:t>
+      </w:r>
+      <w:r>
+        <w:t>=29</w:t>
+      </w:r>
+      <w:r>
+        <w:t xml:space="preserve">, </w:t>
+      </w:r>
+      <w:proofErr w:type="spellStart"/>
+      <w:r>
+        <w:t>indexmin</w:t>
+      </w:r>
+      <w:proofErr w:type="spellEnd"/>
+      <w:r>
+        <w:t>=t</w:t>
+      </w:r>
+      <w:r>
+        <w:t>ab[4</w:t>
+      </w:r>
+      <w:r>
+        <w:t>] &lt;-</w:t>
+      </w:r>
+      <w:r>
+        <w:t xml:space="preserve"> 29</w:t>
+      </w:r>
+    </w:p>
+    <w:p>
+      <w:r>
+        <w:tab/>
+        <w:t>Résultat [10, 13, 14, 25, 29, 37]</w:t>
       </w:r>
     </w:p>
     <w:p/>
-    <w:p>
-      <w:r>
-        <w:t>Premier tour</w:t>
-      </w:r>
-    </w:p>
-    <w:p>
-      <w:r>
-        <w:t>[</w:t>
-      </w:r>
-      <w:r>
-        <w:rPr>
-          <w:u w:val="single"/>
-        </w:rPr>
-        <w:t>5, 1</w:t>
-      </w:r>
-      <w:r>
-        <w:t>, 4, 2, 8] i=0 et j=0 &lt;- compare 5 et 1 donc échange</w:t>
-      </w:r>
-    </w:p>
-    <w:p>
-      <w:r>
-        <w:t xml:space="preserve">[1, </w:t>
-      </w:r>
-      <w:r>
-        <w:rPr>
-          <w:u w:val="single"/>
-        </w:rPr>
-        <w:t>5, 4</w:t>
-      </w:r>
-      <w:r>
-        <w:t>, 2, 8] i=0 et j=1 &lt;- compare 5 et 4 donc échange</w:t>
-      </w:r>
-    </w:p>
-    <w:p>
-      <w:r>
-        <w:t xml:space="preserve">[1, 4, </w:t>
-      </w:r>
-      <w:r>
-        <w:rPr>
-          <w:u w:val="single"/>
-        </w:rPr>
-        <w:t>5, 2</w:t>
-      </w:r>
-      <w:r>
-        <w:t>, 8] i=0 et j=2 &lt;- compare 5 et 2 donc échange</w:t>
-      </w:r>
-    </w:p>
-    <w:p>
-      <w:r>
-        <w:t xml:space="preserve">[1, 4, 2, </w:t>
-      </w:r>
-      <w:r>
-        <w:rPr>
-          <w:u w:val="single"/>
-        </w:rPr>
-        <w:t>5, 8</w:t>
-      </w:r>
-      <w:r>
-        <w:t>] i=0 et j=3 &lt;- compare 5 et 8 donc pas d'échange</w:t>
-      </w:r>
-    </w:p>
-    <w:p>
-      <w:r>
-        <w:t>Deuxième</w:t>
-      </w:r>
-      <w:r>
-        <w:t xml:space="preserve"> tour</w:t>
-      </w:r>
-    </w:p>
-    <w:p>
-      <w:r>
-        <w:t>[</w:t>
-      </w:r>
-      <w:r>
-        <w:rPr>
-          <w:u w:val="single"/>
-        </w:rPr>
-        <w:t>1, 4</w:t>
-      </w:r>
-      <w:r>
-        <w:t>, 2, 5, 8] i=1 et j=0 &lt;- compare 1 et 4 donc pas d'échange</w:t>
-      </w:r>
-    </w:p>
-    <w:p>
-      <w:r>
-        <w:t xml:space="preserve">[1, </w:t>
-      </w:r>
-      <w:r>
-        <w:rPr>
-          <w:u w:val="single"/>
-        </w:rPr>
-        <w:t>4, 2</w:t>
-      </w:r>
-      <w:r>
-        <w:t>, 5, 8] i=1 et j=1 &lt;- compare 4 et 2 donc échange</w:t>
-      </w:r>
-    </w:p>
-    <w:p>
-      <w:r>
-        <w:t xml:space="preserve">[1, 2, </w:t>
-      </w:r>
-      <w:r>
-        <w:rPr>
-          <w:u w:val="single"/>
-        </w:rPr>
-        <w:t>4, 5</w:t>
-      </w:r>
-      <w:r>
-        <w:t>, 8] i=1 et j=2 &lt;- compare 4 et 5 donc pas d'échange</w:t>
-      </w:r>
-    </w:p>
-    <w:p>
-      <w:r>
-        <w:t>Troisième tour</w:t>
-      </w:r>
-    </w:p>
-    <w:p>
-      <w:r>
-        <w:t>[</w:t>
-      </w:r>
-      <w:r>
-        <w:rPr>
-          <w:u w:val="single"/>
-        </w:rPr>
-        <w:t>1, 2,</w:t>
-      </w:r>
-      <w:r>
-        <w:t xml:space="preserve"> 4, 5, 8] i=2 et j=0 &lt;- compare 1 et 2 donc pas d'échange</w:t>
-      </w:r>
-    </w:p>
-    <w:p>
-      <w:r>
-        <w:t xml:space="preserve">[1, </w:t>
-      </w:r>
-      <w:r>
-        <w:rPr>
-          <w:u w:val="single"/>
-        </w:rPr>
-        <w:t>2, 4</w:t>
-      </w:r>
-      <w:r>
-        <w:t>, 5, 8] i=2 et j=1 &lt;- compare 2 et 4 donc pas d'échange</w:t>
-      </w:r>
-    </w:p>
-    <w:p>
-      <w:r>
-        <w:t>Quatrième tour</w:t>
-      </w:r>
-    </w:p>
-    <w:p>
-      <w:r>
-        <w:t>[</w:t>
-      </w:r>
-      <w:r>
-        <w:rPr>
-          <w:u w:val="single"/>
-        </w:rPr>
-        <w:t>1, 2</w:t>
-      </w:r>
-      <w:r>
-        <w:t>, 4, 5, 8] i=3 et j=0 &lt;- compare 1 et 2 donc pas d'échange</w:t>
-      </w:r>
-    </w:p>
+    <w:p/>
+    <w:p/>
+    <w:p/>
+    <w:p/>
     <w:sectPr>
       <w:pgSz w:w="11906" w:h="16838"/>
       <w:pgMar w:top="1417" w:right="1417" w:bottom="1417" w:left="1417" w:header="708" w:footer="708" w:gutter="0"/>
@@ -318,6 +966,127 @@
     </w:sectPr>
   </w:body>
 </w:document>
+</file>
+
+<file path=word/numbering.xml><?xml version="1.0" encoding="utf-8"?>
+<w:numbering xmlns:wpc="http://schemas.microsoft.com/office/word/2010/wordprocessingCanvas" xmlns:cx="http://schemas.microsoft.com/office/drawing/2014/chartex" xmlns:mc="http://schemas.openxmlformats.org/markup-compatibility/2006" xmlns:o="urn:schemas-microsoft-com:office:office" xmlns:r="http://schemas.openxmlformats.org/officeDocument/2006/relationships" xmlns:m="http://schemas.openxmlformats.org/officeDocument/2006/math" xmlns:v="urn:schemas-microsoft-com:vml" xmlns:wp14="http://schemas.microsoft.com/office/word/2010/wordprocessingDrawing" xmlns:wp="http://schemas.openxmlformats.org/drawingml/2006/wordprocessingDrawing" xmlns:w10="urn:schemas-microsoft-com:office:word" xmlns:w="http://schemas.openxmlformats.org/wordprocessingml/2006/main" xmlns:w14="http://schemas.microsoft.com/office/word/2010/wordml" xmlns:w15="http://schemas.microsoft.com/office/word/2012/wordml" xmlns:w16se="http://schemas.microsoft.com/office/word/2015/wordml/symex" xmlns:wpg="http://schemas.microsoft.com/office/word/2010/wordprocessingGroup" xmlns:wpi="http://schemas.microsoft.com/office/word/2010/wordprocessingInk" xmlns:wne="http://schemas.microsoft.com/office/word/2006/wordml" xmlns:wps="http://schemas.microsoft.com/office/word/2010/wordprocessingShape" mc:Ignorable="w14 w15 w16se wp14">
+  <w:abstractNum w:abstractNumId="0" w15:restartNumberingAfterBreak="0">
+    <w:nsid w:val="02DE2063"/>
+    <w:multiLevelType w:val="multilevel"/>
+    <w:tmpl w:val="67081990"/>
+    <w:lvl w:ilvl="0">
+      <w:start w:val="1"/>
+      <w:numFmt w:val="decimal"/>
+      <w:lvlText w:val="%1."/>
+      <w:lvlJc w:val="left"/>
+      <w:pPr>
+        <w:tabs>
+          <w:tab w:val="num" w:pos="720"/>
+        </w:tabs>
+        <w:ind w:left="720" w:hanging="360"/>
+      </w:pPr>
+    </w:lvl>
+    <w:lvl w:ilvl="1" w:tentative="1">
+      <w:start w:val="1"/>
+      <w:numFmt w:val="decimal"/>
+      <w:lvlText w:val="%2."/>
+      <w:lvlJc w:val="left"/>
+      <w:pPr>
+        <w:tabs>
+          <w:tab w:val="num" w:pos="1440"/>
+        </w:tabs>
+        <w:ind w:left="1440" w:hanging="360"/>
+      </w:pPr>
+    </w:lvl>
+    <w:lvl w:ilvl="2" w:tentative="1">
+      <w:start w:val="1"/>
+      <w:numFmt w:val="decimal"/>
+      <w:lvlText w:val="%3."/>
+      <w:lvlJc w:val="left"/>
+      <w:pPr>
+        <w:tabs>
+          <w:tab w:val="num" w:pos="2160"/>
+        </w:tabs>
+        <w:ind w:left="2160" w:hanging="360"/>
+      </w:pPr>
+    </w:lvl>
+    <w:lvl w:ilvl="3" w:tentative="1">
+      <w:start w:val="1"/>
+      <w:numFmt w:val="decimal"/>
+      <w:lvlText w:val="%4."/>
+      <w:lvlJc w:val="left"/>
+      <w:pPr>
+        <w:tabs>
+          <w:tab w:val="num" w:pos="2880"/>
+        </w:tabs>
+        <w:ind w:left="2880" w:hanging="360"/>
+      </w:pPr>
+    </w:lvl>
+    <w:lvl w:ilvl="4" w:tentative="1">
+      <w:start w:val="1"/>
+      <w:numFmt w:val="decimal"/>
+      <w:lvlText w:val="%5."/>
+      <w:lvlJc w:val="left"/>
+      <w:pPr>
+        <w:tabs>
+          <w:tab w:val="num" w:pos="3600"/>
+        </w:tabs>
+        <w:ind w:left="3600" w:hanging="360"/>
+      </w:pPr>
+    </w:lvl>
+    <w:lvl w:ilvl="5" w:tentative="1">
+      <w:start w:val="1"/>
+      <w:numFmt w:val="decimal"/>
+      <w:lvlText w:val="%6."/>
+      <w:lvlJc w:val="left"/>
+      <w:pPr>
+        <w:tabs>
+          <w:tab w:val="num" w:pos="4320"/>
+        </w:tabs>
+        <w:ind w:left="4320" w:hanging="360"/>
+      </w:pPr>
+    </w:lvl>
+    <w:lvl w:ilvl="6" w:tentative="1">
+      <w:start w:val="1"/>
+      <w:numFmt w:val="decimal"/>
+      <w:lvlText w:val="%7."/>
+      <w:lvlJc w:val="left"/>
+      <w:pPr>
+        <w:tabs>
+          <w:tab w:val="num" w:pos="5040"/>
+        </w:tabs>
+        <w:ind w:left="5040" w:hanging="360"/>
+      </w:pPr>
+    </w:lvl>
+    <w:lvl w:ilvl="7" w:tentative="1">
+      <w:start w:val="1"/>
+      <w:numFmt w:val="decimal"/>
+      <w:lvlText w:val="%8."/>
+      <w:lvlJc w:val="left"/>
+      <w:pPr>
+        <w:tabs>
+          <w:tab w:val="num" w:pos="5760"/>
+        </w:tabs>
+        <w:ind w:left="5760" w:hanging="360"/>
+      </w:pPr>
+    </w:lvl>
+    <w:lvl w:ilvl="8" w:tentative="1">
+      <w:start w:val="1"/>
+      <w:numFmt w:val="decimal"/>
+      <w:lvlText w:val="%9."/>
+      <w:lvlJc w:val="left"/>
+      <w:pPr>
+        <w:tabs>
+          <w:tab w:val="num" w:pos="6480"/>
+        </w:tabs>
+        <w:ind w:left="6480" w:hanging="360"/>
+      </w:pPr>
+    </w:lvl>
+  </w:abstractNum>
+  <w:num w:numId="1">
+    <w:abstractNumId w:val="0"/>
+  </w:num>
+</w:numbering>
 </file>
 
 <file path=word/styles.xml><?xml version="1.0" encoding="utf-8"?>
@@ -714,6 +1483,27 @@
     <w:name w:val="Normal"/>
     <w:qFormat/>
   </w:style>
+  <w:style w:type="paragraph" w:styleId="Titre1">
+    <w:name w:val="heading 1"/>
+    <w:basedOn w:val="Normal"/>
+    <w:link w:val="Titre1Car"/>
+    <w:uiPriority w:val="9"/>
+    <w:qFormat/>
+    <w:rsid w:val="00DF7BC5"/>
+    <w:pPr>
+      <w:spacing w:before="100" w:beforeAutospacing="1" w:after="100" w:afterAutospacing="1" w:line="240" w:lineRule="auto"/>
+      <w:outlineLvl w:val="0"/>
+    </w:pPr>
+    <w:rPr>
+      <w:rFonts w:ascii="Times New Roman" w:eastAsia="Times New Roman" w:hAnsi="Times New Roman" w:cs="Times New Roman"/>
+      <w:b/>
+      <w:bCs/>
+      <w:kern w:val="36"/>
+      <w:sz w:val="48"/>
+      <w:szCs w:val="48"/>
+      <w:lang w:eastAsia="fr-FR"/>
+    </w:rPr>
+  </w:style>
   <w:style w:type="character" w:default="1" w:styleId="Policepardfaut">
     <w:name w:val="Default Paragraph Font"/>
     <w:uiPriority w:val="1"/>
@@ -740,6 +1530,35 @@
     <w:uiPriority w:val="99"/>
     <w:semiHidden/>
     <w:unhideWhenUsed/>
+  </w:style>
+  <w:style w:type="character" w:customStyle="1" w:styleId="Titre1Car">
+    <w:name w:val="Titre 1 Car"/>
+    <w:basedOn w:val="Policepardfaut"/>
+    <w:link w:val="Titre1"/>
+    <w:uiPriority w:val="9"/>
+    <w:rsid w:val="00DF7BC5"/>
+    <w:rPr>
+      <w:rFonts w:ascii="Times New Roman" w:eastAsia="Times New Roman" w:hAnsi="Times New Roman" w:cs="Times New Roman"/>
+      <w:b/>
+      <w:bCs/>
+      <w:kern w:val="36"/>
+      <w:sz w:val="48"/>
+      <w:szCs w:val="48"/>
+      <w:lang w:eastAsia="fr-FR"/>
+    </w:rPr>
+  </w:style>
+  <w:style w:type="character" w:styleId="CodeHTML">
+    <w:name w:val="HTML Code"/>
+    <w:basedOn w:val="Policepardfaut"/>
+    <w:uiPriority w:val="99"/>
+    <w:semiHidden/>
+    <w:unhideWhenUsed/>
+    <w:rsid w:val="00DF7BC5"/>
+    <w:rPr>
+      <w:rFonts w:ascii="Courier New" w:eastAsia="Times New Roman" w:hAnsi="Courier New" w:cs="Courier New"/>
+      <w:sz w:val="20"/>
+      <w:szCs w:val="20"/>
+    </w:rPr>
   </w:style>
 </w:styles>
 </file>

</xml_diff>